<commit_message>
feat: 作业3.2 - doc
</commit_message>
<xml_diff>
--- a/人形机器人综合实践课(2025年1期)/三、机器人建模与可视化/doc/作业3.2.docx
+++ b/人形机器人综合实践课(2025年1期)/三、机器人建模与可视化/doc/作业3.2.docx
@@ -11,7 +11,15 @@
         <w:t>CAD 导出实战</w:t>
       </w:r>
       <w:r>
-        <w:t>：在 SolidWorks 软件中设计并简单创建一个不少于 5 个关节的机器人模型。使用导出工具将其转化为标准 URDF 文件，最终通过 ROS 可视化仿真验证其坐标系及运动学连通性的正确性。</w:t>
+        <w:t>：在 SolidWorks 软件中设计并简单创建一个不少于 5 </w:t>
+      </w:r>
+      <w:proofErr w:type="gramStart"/>
+      <w:r>
+        <w:t>个</w:t>
+      </w:r>
+      <w:proofErr w:type="gramEnd"/>
+      <w:r>
+        <w:t>关节的机器人模型。使用导出工具将其转化为标准 URDF 文件，最终通过 ROS 可视化仿真验证其坐标系及运动学连通性的正确性。</w:t>
       </w:r>
       <w:r>
         <w:br/>
@@ -72,14 +80,15 @@
         <w:tblLook w:val="04A0" w:firstRow="1" w:lastRow="0" w:firstColumn="1" w:lastColumn="0" w:noHBand="0" w:noVBand="1"/>
       </w:tblPr>
       <w:tblGrid>
-        <w:gridCol w:w="2765"/>
-        <w:gridCol w:w="2765"/>
-        <w:gridCol w:w="2766"/>
+        <w:gridCol w:w="2159"/>
+        <w:gridCol w:w="1933"/>
+        <w:gridCol w:w="1857"/>
+        <w:gridCol w:w="2347"/>
       </w:tblGrid>
       <w:tr>
         <w:tc>
           <w:tcPr>
-            <w:tcW w:w="2765" w:type="dxa"/>
+            <w:tcW w:w="2159" w:type="dxa"/>
             <w:shd w:val="clear" w:color="auto" w:fill="D1D1D1" w:themeFill="background2" w:themeFillShade="E6"/>
           </w:tcPr>
           <w:p>
@@ -103,7 +112,7 @@
         </w:tc>
         <w:tc>
           <w:tcPr>
-            <w:tcW w:w="2765" w:type="dxa"/>
+            <w:tcW w:w="1933" w:type="dxa"/>
             <w:shd w:val="clear" w:color="auto" w:fill="D1D1D1" w:themeFill="background2" w:themeFillShade="E6"/>
           </w:tcPr>
           <w:p>
@@ -127,7 +136,31 @@
         </w:tc>
         <w:tc>
           <w:tcPr>
-            <w:tcW w:w="2766" w:type="dxa"/>
+            <w:tcW w:w="1857" w:type="dxa"/>
+            <w:shd w:val="clear" w:color="auto" w:fill="D1D1D1" w:themeFill="background2" w:themeFillShade="E6"/>
+          </w:tcPr>
+          <w:p>
+            <w:pPr>
+              <w:jc w:val="center"/>
+              <w:rPr>
+                <w:rFonts w:hint="eastAsia"/>
+                <w:b/>
+                <w:bCs/>
+              </w:rPr>
+            </w:pPr>
+            <w:r>
+              <w:rPr>
+                <w:rFonts w:hint="eastAsia"/>
+                <w:b/>
+                <w:bCs/>
+              </w:rPr>
+              <w:t>名称</w:t>
+            </w:r>
+          </w:p>
+        </w:tc>
+        <w:tc>
+          <w:tcPr>
+            <w:tcW w:w="2347" w:type="dxa"/>
             <w:shd w:val="clear" w:color="auto" w:fill="D1D1D1" w:themeFill="background2" w:themeFillShade="E6"/>
           </w:tcPr>
           <w:p>
@@ -153,7 +186,7 @@
       <w:tr>
         <w:tc>
           <w:tcPr>
-            <w:tcW w:w="2765" w:type="dxa"/>
+            <w:tcW w:w="2159" w:type="dxa"/>
           </w:tcPr>
           <w:p>
             <w:pPr>
@@ -162,17 +195,19 @@
                 <w:rFonts w:hint="eastAsia"/>
               </w:rPr>
             </w:pPr>
+            <w:proofErr w:type="spellStart"/>
             <w:r>
               <w:rPr>
                 <w:rFonts w:hint="eastAsia"/>
               </w:rPr>
               <w:t>base_link</w:t>
             </w:r>
+            <w:proofErr w:type="spellEnd"/>
           </w:p>
         </w:tc>
         <w:tc>
           <w:tcPr>
-            <w:tcW w:w="2765" w:type="dxa"/>
+            <w:tcW w:w="1933" w:type="dxa"/>
           </w:tcPr>
           <w:p>
             <w:pPr>
@@ -191,7 +226,26 @@
         </w:tc>
         <w:tc>
           <w:tcPr>
-            <w:tcW w:w="2766" w:type="dxa"/>
+            <w:tcW w:w="1857" w:type="dxa"/>
+          </w:tcPr>
+          <w:p>
+            <w:pPr>
+              <w:jc w:val="center"/>
+              <w:rPr>
+                <w:rFonts w:hint="eastAsia"/>
+              </w:rPr>
+            </w:pPr>
+            <w:r>
+              <w:rPr>
+                <w:rFonts w:hint="eastAsia"/>
+              </w:rPr>
+              <w:t>基座</w:t>
+            </w:r>
+          </w:p>
+        </w:tc>
+        <w:tc>
+          <w:tcPr>
+            <w:tcW w:w="2347" w:type="dxa"/>
           </w:tcPr>
           <w:p>
             <w:pPr>
@@ -212,7 +266,7 @@
       <w:tr>
         <w:tc>
           <w:tcPr>
-            <w:tcW w:w="2765" w:type="dxa"/>
+            <w:tcW w:w="2159" w:type="dxa"/>
           </w:tcPr>
           <w:p>
             <w:pPr>
@@ -231,7 +285,7 @@
         </w:tc>
         <w:tc>
           <w:tcPr>
-            <w:tcW w:w="2765" w:type="dxa"/>
+            <w:tcW w:w="1933" w:type="dxa"/>
           </w:tcPr>
           <w:p>
             <w:pPr>
@@ -250,7 +304,26 @@
         </w:tc>
         <w:tc>
           <w:tcPr>
-            <w:tcW w:w="2766" w:type="dxa"/>
+            <w:tcW w:w="1857" w:type="dxa"/>
+          </w:tcPr>
+          <w:p>
+            <w:pPr>
+              <w:jc w:val="center"/>
+              <w:rPr>
+                <w:rFonts w:hint="eastAsia"/>
+              </w:rPr>
+            </w:pPr>
+            <w:r>
+              <w:rPr>
+                <w:rFonts w:hint="eastAsia"/>
+              </w:rPr>
+              <w:t>大臂旋转座</w:t>
+            </w:r>
+          </w:p>
+        </w:tc>
+        <w:tc>
+          <w:tcPr>
+            <w:tcW w:w="2347" w:type="dxa"/>
           </w:tcPr>
           <w:p>
             <w:pPr>
@@ -271,7 +344,7 @@
       <w:tr>
         <w:tc>
           <w:tcPr>
-            <w:tcW w:w="2765" w:type="dxa"/>
+            <w:tcW w:w="2159" w:type="dxa"/>
           </w:tcPr>
           <w:p>
             <w:pPr>
@@ -290,7 +363,7 @@
         </w:tc>
         <w:tc>
           <w:tcPr>
-            <w:tcW w:w="2765" w:type="dxa"/>
+            <w:tcW w:w="1933" w:type="dxa"/>
           </w:tcPr>
           <w:p>
             <w:pPr>
@@ -309,7 +382,26 @@
         </w:tc>
         <w:tc>
           <w:tcPr>
-            <w:tcW w:w="2766" w:type="dxa"/>
+            <w:tcW w:w="1857" w:type="dxa"/>
+          </w:tcPr>
+          <w:p>
+            <w:pPr>
+              <w:jc w:val="center"/>
+              <w:rPr>
+                <w:rFonts w:hint="eastAsia"/>
+              </w:rPr>
+            </w:pPr>
+            <w:r>
+              <w:rPr>
+                <w:rFonts w:hint="eastAsia"/>
+              </w:rPr>
+              <w:t>大臂</w:t>
+            </w:r>
+          </w:p>
+        </w:tc>
+        <w:tc>
+          <w:tcPr>
+            <w:tcW w:w="2347" w:type="dxa"/>
           </w:tcPr>
           <w:p>
             <w:pPr>
@@ -330,7 +422,7 @@
       <w:tr>
         <w:tc>
           <w:tcPr>
-            <w:tcW w:w="2765" w:type="dxa"/>
+            <w:tcW w:w="2159" w:type="dxa"/>
           </w:tcPr>
           <w:p>
             <w:pPr>
@@ -349,7 +441,7 @@
         </w:tc>
         <w:tc>
           <w:tcPr>
-            <w:tcW w:w="2765" w:type="dxa"/>
+            <w:tcW w:w="1933" w:type="dxa"/>
           </w:tcPr>
           <w:p>
             <w:pPr>
@@ -368,7 +460,26 @@
         </w:tc>
         <w:tc>
           <w:tcPr>
-            <w:tcW w:w="2766" w:type="dxa"/>
+            <w:tcW w:w="1857" w:type="dxa"/>
+          </w:tcPr>
+          <w:p>
+            <w:pPr>
+              <w:jc w:val="center"/>
+              <w:rPr>
+                <w:rFonts w:hint="eastAsia"/>
+              </w:rPr>
+            </w:pPr>
+            <w:r>
+              <w:rPr>
+                <w:rFonts w:hint="eastAsia"/>
+              </w:rPr>
+              <w:t>小臂</w:t>
+            </w:r>
+          </w:p>
+        </w:tc>
+        <w:tc>
+          <w:tcPr>
+            <w:tcW w:w="2347" w:type="dxa"/>
           </w:tcPr>
           <w:p>
             <w:pPr>
@@ -389,7 +500,7 @@
       <w:tr>
         <w:tc>
           <w:tcPr>
-            <w:tcW w:w="2765" w:type="dxa"/>
+            <w:tcW w:w="2159" w:type="dxa"/>
           </w:tcPr>
           <w:p>
             <w:pPr>
@@ -408,7 +519,7 @@
         </w:tc>
         <w:tc>
           <w:tcPr>
-            <w:tcW w:w="2765" w:type="dxa"/>
+            <w:tcW w:w="1933" w:type="dxa"/>
           </w:tcPr>
           <w:p>
             <w:pPr>
@@ -427,7 +538,26 @@
         </w:tc>
         <w:tc>
           <w:tcPr>
-            <w:tcW w:w="2766" w:type="dxa"/>
+            <w:tcW w:w="1857" w:type="dxa"/>
+          </w:tcPr>
+          <w:p>
+            <w:pPr>
+              <w:jc w:val="center"/>
+              <w:rPr>
+                <w:rFonts w:hint="eastAsia"/>
+              </w:rPr>
+            </w:pPr>
+            <w:r>
+              <w:rPr>
+                <w:rFonts w:hint="eastAsia"/>
+              </w:rPr>
+              <w:t>手腕旋转</w:t>
+            </w:r>
+          </w:p>
+        </w:tc>
+        <w:tc>
+          <w:tcPr>
+            <w:tcW w:w="2347" w:type="dxa"/>
           </w:tcPr>
           <w:p>
             <w:pPr>
@@ -448,7 +578,7 @@
       <w:tr>
         <w:tc>
           <w:tcPr>
-            <w:tcW w:w="2765" w:type="dxa"/>
+            <w:tcW w:w="2159" w:type="dxa"/>
           </w:tcPr>
           <w:p>
             <w:pPr>
@@ -467,7 +597,7 @@
         </w:tc>
         <w:tc>
           <w:tcPr>
-            <w:tcW w:w="2765" w:type="dxa"/>
+            <w:tcW w:w="1933" w:type="dxa"/>
           </w:tcPr>
           <w:p>
             <w:pPr>
@@ -486,7 +616,26 @@
         </w:tc>
         <w:tc>
           <w:tcPr>
-            <w:tcW w:w="2766" w:type="dxa"/>
+            <w:tcW w:w="1857" w:type="dxa"/>
+          </w:tcPr>
+          <w:p>
+            <w:pPr>
+              <w:jc w:val="center"/>
+              <w:rPr>
+                <w:rFonts w:hint="eastAsia"/>
+              </w:rPr>
+            </w:pPr>
+            <w:r>
+              <w:rPr>
+                <w:rFonts w:hint="eastAsia"/>
+              </w:rPr>
+              <w:t>末端执行器</w:t>
+            </w:r>
+          </w:p>
+        </w:tc>
+        <w:tc>
+          <w:tcPr>
+            <w:tcW w:w="2347" w:type="dxa"/>
           </w:tcPr>
           <w:p>
             <w:pPr>
@@ -506,17 +655,60 @@
       </w:tr>
     </w:tbl>
     <w:p>
-      <w:pPr>
-        <w:rPr>
-          <w:rFonts w:hint="eastAsia"/>
-        </w:rPr>
-      </w:pPr>
-      <w:r>
-        <w:rPr>
-          <w:rFonts w:hint="eastAsia"/>
-        </w:rPr>
-        <w:t>（SolidWorks使用不熟练，不少参数和坐标设置有偏差）</w:t>
-      </w:r>
+      <w:r>
+        <w:rPr>
+          <w:rFonts w:hint="eastAsia"/>
+        </w:rPr>
+        <w:t>（SolidWorks</w:t>
+      </w:r>
+      <w:r>
+        <w:rPr>
+          <w:rFonts w:hint="eastAsia"/>
+        </w:rPr>
+        <w:t>目前</w:t>
+      </w:r>
+      <w:r>
+        <w:rPr>
+          <w:rFonts w:hint="eastAsia"/>
+        </w:rPr>
+        <w:t>使用不熟练，不少参数和坐标设置有偏差）</w:t>
+      </w:r>
+    </w:p>
+    <w:p>
+      <w:pPr>
+        <w:rPr>
+          <w:rFonts w:hint="eastAsia"/>
+        </w:rPr>
+      </w:pPr>
+      <w:r>
+        <w:rPr>
+          <w:rFonts w:hint="eastAsia"/>
+        </w:rPr>
+        <w:t>创建的零件和装配参见</w:t>
+      </w:r>
+      <w:hyperlink r:id="rId5" w:history="1">
+        <w:r>
+          <w:rPr>
+            <w:rStyle w:val="af"/>
+            <w:rFonts w:hint="eastAsia"/>
+          </w:rPr>
+          <w:t>https://github.com/acodeur/r</w:t>
+        </w:r>
+        <w:r>
+          <w:rPr>
+            <w:rStyle w:val="af"/>
+            <w:rFonts w:hint="eastAsia"/>
+          </w:rPr>
+          <w:t>o</w:t>
+        </w:r>
+        <w:r>
+          <w:rPr>
+            <w:rStyle w:val="af"/>
+            <w:rFonts w:hint="eastAsia"/>
+          </w:rPr>
+          <w:t>bot-course-practice/tree/main/人形机器人综合实践课(2025年1期)/三、机器人建模与可视化/作业3.2/sw</w:t>
+        </w:r>
+      </w:hyperlink>
     </w:p>
     <w:p>
       <w:pPr>
@@ -576,7 +768,7 @@
                     <pic:cNvPicPr/>
                   </pic:nvPicPr>
                   <pic:blipFill>
-                    <a:blip r:embed="rId5"/>
+                    <a:blip r:embed="rId6"/>
                     <a:stretch>
                       <a:fillRect/>
                     </a:stretch>
@@ -624,7 +816,7 @@
                     <pic:cNvPicPr/>
                   </pic:nvPicPr>
                   <pic:blipFill>
-                    <a:blip r:embed="rId6"/>
+                    <a:blip r:embed="rId7"/>
                     <a:stretch>
                       <a:fillRect/>
                     </a:stretch>
@@ -664,7 +856,7 @@
                     <pic:cNvPicPr/>
                   </pic:nvPicPr>
                   <pic:blipFill>
-                    <a:blip r:embed="rId7"/>
+                    <a:blip r:embed="rId8"/>
                     <a:stretch>
                       <a:fillRect/>
                     </a:stretch>
@@ -747,7 +939,7 @@
                     </pic:cNvPicPr>
                   </pic:nvPicPr>
                   <pic:blipFill>
-                    <a:blip r:embed="rId8" cstate="print">
+                    <a:blip r:embed="rId9" cstate="print">
                       <a:extLst>
                         <a:ext uri="{28A0092B-C50C-407E-A947-70E740481C1C}">
                           <a14:useLocalDpi xmlns:a14="http://schemas.microsoft.com/office/drawing/2010/main" val="0"/>
@@ -787,6 +979,7 @@
           <w:numId w:val="2"/>
         </w:numPr>
       </w:pPr>
+      <w:proofErr w:type="spellStart"/>
       <w:r>
         <w:rPr>
           <w:rFonts w:hint="eastAsia"/>
@@ -797,8 +990,23 @@
         <w:rPr>
           <w:rFonts w:hint="eastAsia"/>
         </w:rPr>
-        <w:t>scode插件可视化urdf</w:t>
-      </w:r>
+        <w:t>scode</w:t>
+      </w:r>
+      <w:proofErr w:type="spellEnd"/>
+      <w:r>
+        <w:rPr>
+          <w:rFonts w:hint="eastAsia"/>
+        </w:rPr>
+        <w:t>插件可视化</w:t>
+      </w:r>
+      <w:proofErr w:type="spellStart"/>
+      <w:r>
+        <w:rPr>
+          <w:rFonts w:hint="eastAsia"/>
+        </w:rPr>
+        <w:t>urdf</w:t>
+      </w:r>
+      <w:proofErr w:type="spellEnd"/>
     </w:p>
     <w:p>
       <w:pPr>
@@ -829,7 +1037,7 @@
                     </pic:cNvPicPr>
                   </pic:nvPicPr>
                   <pic:blipFill>
-                    <a:blip r:embed="rId9" cstate="print">
+                    <a:blip r:embed="rId10" cstate="print">
                       <a:extLst>
                         <a:ext uri="{28A0092B-C50C-407E-A947-70E740481C1C}">
                           <a14:useLocalDpi xmlns:a14="http://schemas.microsoft.com/office/drawing/2010/main" val="0"/>
@@ -885,7 +1093,21 @@
           <w:rFonts w:hint="eastAsia"/>
         </w:rPr>
         <w:lastRenderedPageBreak/>
-        <w:t>将导出的arm_5dof文件夹置于src下，再回到上级目录依次执行</w:t>
+        <w:t>将导出的arm_5dof文件夹置于</w:t>
+      </w:r>
+      <w:proofErr w:type="spellStart"/>
+      <w:r>
+        <w:rPr>
+          <w:rFonts w:hint="eastAsia"/>
+        </w:rPr>
+        <w:t>src</w:t>
+      </w:r>
+      <w:proofErr w:type="spellEnd"/>
+      <w:r>
+        <w:rPr>
+          <w:rFonts w:hint="eastAsia"/>
+        </w:rPr>
+        <w:t>下，再回到上级目录依次执行</w:t>
       </w:r>
     </w:p>
     <w:p>
@@ -895,12 +1117,14 @@
           <w:rFonts w:hint="eastAsia"/>
         </w:rPr>
       </w:pPr>
+      <w:proofErr w:type="spellStart"/>
       <w:r>
         <w:rPr>
           <w:rFonts w:hint="eastAsia"/>
         </w:rPr>
         <w:t>catkin_make</w:t>
       </w:r>
+      <w:proofErr w:type="spellEnd"/>
     </w:p>
     <w:p>
       <w:pPr>
@@ -910,8 +1134,16 @@
         <w:rPr>
           <w:rFonts w:hint="eastAsia"/>
         </w:rPr>
-        <w:t>source devel/setup.bash</w:t>
-      </w:r>
+        <w:t>source devel/</w:t>
+      </w:r>
+      <w:proofErr w:type="spellStart"/>
+      <w:r>
+        <w:rPr>
+          <w:rFonts w:hint="eastAsia"/>
+        </w:rPr>
+        <w:t>setup.bash</w:t>
+      </w:r>
+      <w:proofErr w:type="spellEnd"/>
     </w:p>
     <w:p>
       <w:pPr>
@@ -920,11 +1152,19 @@
           <w:rFonts w:hint="eastAsia"/>
         </w:rPr>
       </w:pPr>
-      <w:r>
-        <w:rPr>
-          <w:rFonts w:hint="eastAsia"/>
-        </w:rPr>
-        <w:t>roslaunch arm_</w:t>
+      <w:proofErr w:type="spellStart"/>
+      <w:r>
+        <w:rPr>
+          <w:rFonts w:hint="eastAsia"/>
+        </w:rPr>
+        <w:t>roslaunch</w:t>
+      </w:r>
+      <w:proofErr w:type="spellEnd"/>
+      <w:r>
+        <w:rPr>
+          <w:rFonts w:hint="eastAsia"/>
+        </w:rPr>
+        <w:t xml:space="preserve"> arm_</w:t>
       </w:r>
       <w:r>
         <w:rPr>
@@ -936,8 +1176,18 @@
         <w:rPr>
           <w:rFonts w:hint="eastAsia"/>
         </w:rPr>
-        <w:t xml:space="preserve"> display.launch</w:t>
-      </w:r>
+        <w:t xml:space="preserve"> </w:t>
+      </w:r>
+      <w:proofErr w:type="spellStart"/>
+      <w:proofErr w:type="gramStart"/>
+      <w:r>
+        <w:rPr>
+          <w:rFonts w:hint="eastAsia"/>
+        </w:rPr>
+        <w:t>display.launch</w:t>
+      </w:r>
+      <w:proofErr w:type="spellEnd"/>
+      <w:proofErr w:type="gramEnd"/>
     </w:p>
     <w:p>
       <w:pPr>
@@ -965,7 +1215,7 @@
                     </pic:cNvPicPr>
                   </pic:nvPicPr>
                   <pic:blipFill>
-                    <a:blip r:embed="rId10" cstate="print">
+                    <a:blip r:embed="rId11" cstate="print">
                       <a:extLst>
                         <a:ext uri="{28A0092B-C50C-407E-A947-70E740481C1C}">
                           <a14:useLocalDpi xmlns:a14="http://schemas.microsoft.com/office/drawing/2010/main" val="0"/>
@@ -2188,6 +2438,41 @@
       </w:tblBorders>
     </w:tblPr>
   </w:style>
+  <w:style w:type="character" w:styleId="af">
+    <w:name w:val="Hyperlink"/>
+    <w:basedOn w:val="a0"/>
+    <w:uiPriority w:val="99"/>
+    <w:unhideWhenUsed/>
+    <w:rsid w:val="00477C6D"/>
+    <w:rPr>
+      <w:color w:val="467886" w:themeColor="hyperlink"/>
+      <w:u w:val="single"/>
+    </w:rPr>
+  </w:style>
+  <w:style w:type="character" w:styleId="af0">
+    <w:name w:val="Unresolved Mention"/>
+    <w:basedOn w:val="a0"/>
+    <w:uiPriority w:val="99"/>
+    <w:semiHidden/>
+    <w:unhideWhenUsed/>
+    <w:rsid w:val="00477C6D"/>
+    <w:rPr>
+      <w:color w:val="605E5C"/>
+      <w:shd w:val="clear" w:color="auto" w:fill="E1DFDD"/>
+    </w:rPr>
+  </w:style>
+  <w:style w:type="character" w:styleId="af1">
+    <w:name w:val="FollowedHyperlink"/>
+    <w:basedOn w:val="a0"/>
+    <w:uiPriority w:val="99"/>
+    <w:semiHidden/>
+    <w:unhideWhenUsed/>
+    <w:rsid w:val="00477C6D"/>
+    <w:rPr>
+      <w:color w:val="96607D" w:themeColor="followedHyperlink"/>
+      <w:u w:val="single"/>
+    </w:rPr>
+  </w:style>
 </w:styles>
 </file>
 

</xml_diff>